<commit_message>
Add consumer follow-up system + update contracts and operations manual
- contract_template.docx: Added 成約報告義務 (reporting obligation with 1.5x penalty),
  リード対応義務 (48-hour response SLA), 消費者フォロー (consumer follow-up rights)
  to both 掲載契約書 and 反響課金契約書
- operations_manual.docx: Added Chapter 5 - Consumer Follow-up Rules
  (9-email auto sequence, survey design, contract confirmation flow,
  non-responsive builder escalation, monthly status check)
- payhome_sales_v2.xlsx: Added 消費者フォローメール sheet with 9 email templates
  (all include unsubscribe link per user requirement)

Co-Authored-By: Claude Opus 4.6 (1M context) <noreply@anthropic.com>
</commit_message>
<xml_diff>
--- a/docs/contract_template.docx
+++ b/docs/contract_template.docx
@@ -478,8 +478,50 @@
           <w:rFonts w:ascii="Yu Mincho" w:hAnsi="Yu Mincho"/>
           <w:b/>
           <w:sz w:val="21"/>
+          <w:bCs/>
         </w:rPr>
-        <w:t>第8条（知的財産権）</w:t>
+        <w:t xml:space="preserve">第8条（成約報告義務）</w:t>
+      </w:r>
+    </w:p>
+    <w:p>
+      <w:r>
+        <w:rPr>
+          <w:rFonts w:eastAsia="Yu Mincho"/>
+          <w:rFonts w:ascii="Yu Mincho" w:hAnsi="Yu Mincho"/>
+          <w:sz w:val="21"/>
+        </w:rPr>
+        <w:t xml:space="preserve">1. 乙は、甲を通じて紹介を受けた住宅検討者との間で建築請負契約が成立した場合、成立日から14日以内に甲に書面（メールを含む）で報告するものとする。</w:t>
+      </w:r>
+    </w:p>
+    <w:p>
+      <w:r>
+        <w:rPr>
+          <w:rFonts w:eastAsia="Yu Mincho"/>
+          <w:rFonts w:ascii="Yu Mincho" w:hAnsi="Yu Mincho"/>
+          <w:sz w:val="21"/>
+        </w:rPr>
+        <w:t xml:space="preserve">2. 甲は、紹介した住宅検討者に対して検討状況の確認を目的としたフォローアンケートを実施できるものとする。</w:t>
+      </w:r>
+    </w:p>
+    <w:p>
+      <w:r>
+        <w:rPr>
+          <w:rFonts w:eastAsia="Yu Mincho"/>
+          <w:rFonts w:ascii="Yu Mincho" w:hAnsi="Yu Mincho"/>
+          <w:sz w:val="21"/>
+        </w:rPr>
+        <w:t xml:space="preserve">3. 乙は、甲からの月次ステータス確認に誠実に回答するものとする。</w:t>
+      </w:r>
+    </w:p>
+    <w:p>
+      <w:r>
+        <w:rPr>
+          <w:rFonts w:eastAsia="Yu Mincho"/>
+          <w:rFonts w:ascii="Yu Mincho" w:hAnsi="Yu Mincho"/>
+          <w:b/>
+          <w:sz w:val="21"/>
+        </w:rPr>
+        <w:t>第9条（知的財産権）</w:t>
       </w:r>
     </w:p>
     <w:p>
@@ -523,7 +565,7 @@
           <w:b/>
           <w:sz w:val="21"/>
         </w:rPr>
-        <w:t>第9条（秘密保持）</w:t>
+        <w:t>第10条（秘密保持）</w:t>
       </w:r>
     </w:p>
     <w:p>
@@ -556,7 +598,7 @@
           <w:b/>
           <w:sz w:val="21"/>
         </w:rPr>
-        <w:t>第10条（個人情報の取扱い）</w:t>
+        <w:t>第11条（個人情報の取扱い）</w:t>
       </w:r>
     </w:p>
     <w:p>
@@ -600,7 +642,7 @@
           <w:b/>
           <w:sz w:val="21"/>
         </w:rPr>
-        <w:t>第11条（解約）</w:t>
+        <w:t>第12条（解約）</w:t>
       </w:r>
     </w:p>
     <w:p>
@@ -689,7 +731,7 @@
           <w:b/>
           <w:sz w:val="21"/>
         </w:rPr>
-        <w:t>第12条（損害賠償）</w:t>
+        <w:t>第13条（損害賠償）</w:t>
       </w:r>
     </w:p>
     <w:p>
@@ -722,7 +764,7 @@
           <w:b/>
           <w:sz w:val="21"/>
         </w:rPr>
-        <w:t>第13条（反社会的勢力の排除）</w:t>
+        <w:t>第14条（反社会的勢力の排除）</w:t>
       </w:r>
     </w:p>
     <w:p>
@@ -755,7 +797,7 @@
           <w:b/>
           <w:sz w:val="21"/>
         </w:rPr>
-        <w:t>第14条（協議事項）</w:t>
+        <w:t>第15条（協議事項）</w:t>
       </w:r>
     </w:p>
     <w:p>
@@ -777,7 +819,7 @@
           <w:b/>
           <w:sz w:val="21"/>
         </w:rPr>
-        <w:t>第15条（管轄裁判所）</w:t>
+        <w:t>第16条（管轄裁判所）</w:t>
       </w:r>
     </w:p>
     <w:p>
@@ -1067,8 +1109,184 @@
           <w:rFonts w:ascii="Yu Mincho" w:hAnsi="Yu Mincho"/>
           <w:b/>
           <w:sz w:val="21"/>
+          <w:bCs/>
         </w:rPr>
-        <w:t>第3条（反響課金の料金）</w:t>
+        <w:t xml:space="preserve">第3条（成約報告義務）</w:t>
+      </w:r>
+    </w:p>
+    <w:p>
+      <w:r>
+        <w:rPr>
+          <w:rFonts w:eastAsia="Yu Mincho"/>
+          <w:rFonts w:ascii="Yu Mincho" w:hAnsi="Yu Mincho"/>
+          <w:sz w:val="21"/>
+        </w:rPr>
+        <w:t xml:space="preserve">1. 乙は、甲から送客されたリード顧客との間で建築請負契約が成立した場合、成立日から14日以内に甲に書面（メールを含む）で報告するものとする。報告には、契約日、契約金額、契約者名を含むものとする。</w:t>
+      </w:r>
+    </w:p>
+    <w:p>
+      <w:r>
+        <w:rPr>
+          <w:rFonts w:eastAsia="Yu Mincho"/>
+          <w:rFonts w:ascii="Yu Mincho" w:hAnsi="Yu Mincho"/>
+          <w:sz w:val="21"/>
+        </w:rPr>
+        <w:t xml:space="preserve">2. 甲は、送客したリード顧客に対して検討状況の確認を目的としたフォローアンケートを実施できるものとし、乙はこれに異議を述べないものとする。</w:t>
+      </w:r>
+    </w:p>
+    <w:p>
+      <w:r>
+        <w:rPr>
+          <w:rFonts w:eastAsia="Yu Mincho"/>
+          <w:rFonts w:ascii="Yu Mincho" w:hAnsi="Yu Mincho"/>
+          <w:sz w:val="21"/>
+        </w:rPr>
+        <w:t xml:space="preserve">3. 甲が送客したリード顧客が、送客日から12ヶ月以内に乙と建築請負契約を締結した場合、当該契約は甲の送客に起因するものとみなす。</w:t>
+      </w:r>
+    </w:p>
+    <w:p>
+      <w:r>
+        <w:rPr>
+          <w:rFonts w:eastAsia="Yu Mincho"/>
+          <w:rFonts w:ascii="Yu Mincho" w:hAnsi="Yu Mincho"/>
+          <w:sz w:val="21"/>
+        </w:rPr>
+        <w:t xml:space="preserve">4. 乙が第1項の報告を怠り、甲が第2項のアンケート等により成約の事実を確認した場合、甲は以下の措置を取ることができる。</w:t>
+      </w:r>
+    </w:p>
+    <w:p>
+      <w:r>
+        <w:rPr>
+          <w:rFonts w:eastAsia="Yu Mincho"/>
+          <w:rFonts w:ascii="Yu Mincho" w:hAnsi="Yu Mincho"/>
+          <w:sz w:val="21"/>
+        </w:rPr>
+        <w:t xml:space="preserve">　① 成約報酬の1.5倍を違約金として請求</w:t>
+      </w:r>
+    </w:p>
+    <w:p>
+      <w:r>
+        <w:rPr>
+          <w:rFonts w:eastAsia="Yu Mincho"/>
+          <w:rFonts w:ascii="Yu Mincho" w:hAnsi="Yu Mincho"/>
+          <w:sz w:val="21"/>
+        </w:rPr>
+        <w:t xml:space="preserve">　② 以降のリード送客を停止</w:t>
+      </w:r>
+    </w:p>
+    <w:p>
+      <w:r>
+        <w:rPr>
+          <w:rFonts w:eastAsia="Yu Mincho"/>
+          <w:rFonts w:ascii="Yu Mincho" w:hAnsi="Yu Mincho"/>
+          <w:sz w:val="21"/>
+        </w:rPr>
+        <w:t xml:space="preserve">　③ 本契約を即時解除</w:t>
+      </w:r>
+    </w:p>
+    <w:p>
+      <w:r>
+        <w:rPr>
+          <w:rFonts w:eastAsia="Yu Mincho"/>
+          <w:rFonts w:ascii="Yu Mincho" w:hAnsi="Yu Mincho"/>
+          <w:sz w:val="21"/>
+        </w:rPr>
+        <w:t xml:space="preserve">5. 乙は、甲から送客されたリード顧客のステータスについて、甲が月次で実施するステータス確認に誠実に回答するものとする。</w:t>
+      </w:r>
+    </w:p>
+    <w:p>
+      <w:r>
+        <w:rPr>
+          <w:rFonts w:eastAsia="Yu Mincho"/>
+          <w:rFonts w:ascii="Yu Mincho" w:hAnsi="Yu Mincho"/>
+          <w:b/>
+          <w:sz w:val="21"/>
+          <w:bCs/>
+        </w:rPr>
+        <w:t xml:space="preserve">第4条（リード対応義務）</w:t>
+      </w:r>
+    </w:p>
+    <w:p>
+      <w:r>
+        <w:rPr>
+          <w:rFonts w:eastAsia="Yu Mincho"/>
+          <w:rFonts w:ascii="Yu Mincho" w:hAnsi="Yu Mincho"/>
+          <w:sz w:val="21"/>
+        </w:rPr>
+        <w:t xml:space="preserve">1. 乙は、甲から送客されたリードに対し、48時間以内に初回連絡を行うものとする。</w:t>
+      </w:r>
+    </w:p>
+    <w:p>
+      <w:r>
+        <w:rPr>
+          <w:rFonts w:eastAsia="Yu Mincho"/>
+          <w:rFonts w:ascii="Yu Mincho" w:hAnsi="Yu Mincho"/>
+          <w:sz w:val="21"/>
+        </w:rPr>
+        <w:t xml:space="preserve">2. 乙が前項の対応を怠った場合、甲は当該リードを他の掲載企業に再配分できるものとする。</w:t>
+      </w:r>
+    </w:p>
+    <w:p>
+      <w:r>
+        <w:rPr>
+          <w:rFonts w:eastAsia="Yu Mincho"/>
+          <w:rFonts w:ascii="Yu Mincho" w:hAnsi="Yu Mincho"/>
+          <w:sz w:val="21"/>
+        </w:rPr>
+        <w:t xml:space="preserve">3. 乙は、リード対応の結果（連絡済み・商談設定・対応不可等）を、対応後速やかに甲に報告するものとする。</w:t>
+      </w:r>
+    </w:p>
+    <w:p>
+      <w:r>
+        <w:rPr>
+          <w:rFonts w:eastAsia="Yu Mincho"/>
+          <w:rFonts w:ascii="Yu Mincho" w:hAnsi="Yu Mincho"/>
+          <w:b/>
+          <w:sz w:val="21"/>
+          <w:bCs/>
+        </w:rPr>
+        <w:t xml:space="preserve">第5条（消費者フォロー）</w:t>
+      </w:r>
+    </w:p>
+    <w:p>
+      <w:r>
+        <w:rPr>
+          <w:rFonts w:eastAsia="Yu Mincho"/>
+          <w:rFonts w:ascii="Yu Mincho" w:hAnsi="Yu Mincho"/>
+          <w:sz w:val="21"/>
+        </w:rPr>
+        <w:t xml:space="preserve">1. 甲は、送客したリード顧客に対し、検討状況の確認、追加情報の提供、満足度調査等を目的として、メール、LINE、アンケート等による継続的なフォローを実施する。</w:t>
+      </w:r>
+    </w:p>
+    <w:p>
+      <w:r>
+        <w:rPr>
+          <w:rFonts w:eastAsia="Yu Mincho"/>
+          <w:rFonts w:ascii="Yu Mincho" w:hAnsi="Yu Mincho"/>
+          <w:sz w:val="21"/>
+        </w:rPr>
+        <w:t xml:space="preserve">2. 乙は、甲による前項のフォローが、乙の営業活動を妨げないよう配慮されていることを確認し、これに同意する。</w:t>
+      </w:r>
+    </w:p>
+    <w:p>
+      <w:r>
+        <w:rPr>
+          <w:rFonts w:eastAsia="Yu Mincho"/>
+          <w:rFonts w:ascii="Yu Mincho" w:hAnsi="Yu Mincho"/>
+          <w:sz w:val="21"/>
+        </w:rPr>
+        <w:t xml:space="preserve">3. 甲は、消費者フォローにより取得した情報のうち、乙に関連する情報を乙に共有するものとする。</w:t>
+      </w:r>
+    </w:p>
+    <w:p>
+      <w:r>
+        <w:rPr>
+          <w:rFonts w:eastAsia="Yu Mincho"/>
+          <w:rFonts w:ascii="Yu Mincho" w:hAnsi="Yu Mincho"/>
+          <w:b/>
+          <w:sz w:val="21"/>
+        </w:rPr>
+        <w:t>第6条（反響課金の料金）</w:t>
       </w:r>
     </w:p>
     <w:p>
@@ -1112,7 +1330,7 @@
           <w:b/>
           <w:sz w:val="21"/>
         </w:rPr>
-        <w:t>第4条（反響の報告）</w:t>
+        <w:t>第7条（反響の報告）</w:t>
       </w:r>
     </w:p>
     <w:p>
@@ -1145,7 +1363,7 @@
           <w:b/>
           <w:sz w:val="21"/>
         </w:rPr>
-        <w:t>第5条（支払条件）</w:t>
+        <w:t>第8条（支払条件）</w:t>
       </w:r>
     </w:p>
     <w:p>
@@ -1189,7 +1407,7 @@
           <w:b/>
           <w:sz w:val="21"/>
         </w:rPr>
-        <w:t>第6条（反響の品質保証）</w:t>
+        <w:t>第9条（反響の品質保証）</w:t>
       </w:r>
     </w:p>
     <w:p>
@@ -1278,7 +1496,7 @@
           <w:b/>
           <w:sz w:val="21"/>
         </w:rPr>
-        <w:t>第7条（反響対応義務）</w:t>
+        <w:t>第10条（反響対応義務）</w:t>
       </w:r>
     </w:p>
     <w:p>
@@ -1311,7 +1529,7 @@
           <w:b/>
           <w:sz w:val="21"/>
         </w:rPr>
-        <w:t>第8条（成約情報の共有）</w:t>
+        <w:t>第11条（成約情報の共有）</w:t>
       </w:r>
     </w:p>
     <w:p>
@@ -1355,7 +1573,7 @@
           <w:b/>
           <w:sz w:val="21"/>
         </w:rPr>
-        <w:t>第9条（契約期間）</w:t>
+        <w:t>第12条（契約期間）</w:t>
       </w:r>
     </w:p>
     <w:p>
@@ -1388,7 +1606,7 @@
           <w:b/>
           <w:sz w:val="21"/>
         </w:rPr>
-        <w:t>第10条（解約）</w:t>
+        <w:t>第13条（解約）</w:t>
       </w:r>
     </w:p>
     <w:p>
@@ -1421,7 +1639,7 @@
           <w:b/>
           <w:sz w:val="21"/>
         </w:rPr>
-        <w:t>第11条（秘密保持）</w:t>
+        <w:t>第14条（秘密保持）</w:t>
       </w:r>
     </w:p>
     <w:p>
@@ -1454,7 +1672,7 @@
           <w:b/>
           <w:sz w:val="21"/>
         </w:rPr>
-        <w:t>第12条（個人情報の取扱い）</w:t>
+        <w:t>第15条（個人情報の取扱い）</w:t>
       </w:r>
     </w:p>
     <w:p>
@@ -1498,7 +1716,7 @@
           <w:b/>
           <w:sz w:val="21"/>
         </w:rPr>
-        <w:t>第13条（反社会的勢力の排除）</w:t>
+        <w:t>第16条（反社会的勢力の排除）</w:t>
       </w:r>
     </w:p>
     <w:p>
@@ -1531,7 +1749,7 @@
           <w:b/>
           <w:sz w:val="21"/>
         </w:rPr>
-        <w:t>第14条（管轄裁判所）</w:t>
+        <w:t>第17条（管轄裁判所）</w:t>
       </w:r>
     </w:p>
     <w:p>

</xml_diff>